<commit_message>
Add figure support and 9 figures to neutrals guide (schemes, phasor diagrams, curves)
</commit_message>
<xml_diff>
--- a/Результаты/методичка_нейтрали.docx
+++ b/Результаты/методичка_нейтрали.docx
@@ -479,6 +479,60 @@
       <w:pPr/>
       <w:r>
         <w:t>Глухозаземлённая нейтраль (Z_N = 0): сети до 1 кВ (системы TN) и сверхвысокого напряжения (330–750 кВ). При пробое — большой ток КЗ, мгновенное отключение; обеспечивает электробезопасность.</w:t>
+      </w:r>
+    </w:p>
+    <w:p>
+      <w:pPr>
+        <w:spacing w:before="240" w:after="120"/>
+        <w:jc w:val="center"/>
+      </w:pPr>
+      <w:r>
+        <w:drawing>
+          <wp:inline xmlns:a="http://schemas.openxmlformats.org/drawingml/2006/main" xmlns:pic="http://schemas.openxmlformats.org/drawingml/2006/picture">
+            <wp:extent cx="5400000" cy="1661371"/>
+            <wp:docPr id="1" name="Picture 1"/>
+            <wp:cNvGraphicFramePr>
+              <a:graphicFrameLocks noChangeAspect="1"/>
+            </wp:cNvGraphicFramePr>
+            <a:graphic>
+              <a:graphicData uri="http://schemas.openxmlformats.org/drawingml/2006/picture">
+                <pic:pic>
+                  <pic:nvPicPr>
+                    <pic:cNvPr id="0" name="fig_neutral_modes.png"/>
+                    <pic:cNvPicPr/>
+                  </pic:nvPicPr>
+                  <pic:blipFill>
+                    <a:blip r:embed="rId9"/>
+                    <a:stretch>
+                      <a:fillRect/>
+                    </a:stretch>
+                  </pic:blipFill>
+                  <pic:spPr>
+                    <a:xfrm>
+                      <a:off x="0" y="0"/>
+                      <a:ext cx="5400000" cy="1661371"/>
+                    </a:xfrm>
+                    <a:prstGeom prst="rect"/>
+                  </pic:spPr>
+                </pic:pic>
+              </a:graphicData>
+            </a:graphic>
+          </wp:inline>
+        </w:drawing>
+      </w:r>
+    </w:p>
+    <w:p>
+      <w:pPr>
+        <w:spacing w:before="120" w:after="240"/>
+        <w:jc w:val="center"/>
+      </w:pPr>
+      <w:r>
+        <w:rPr>
+          <w:rFonts w:ascii="Times New Roman" w:hAnsi="Times New Roman"/>
+          <w:b w:val="0"/>
+          <w:sz w:val="28"/>
+        </w:rPr>
+        <w:t>Рисунок 1 — Основные режимы заземления нейтрали: изолированная, компенсированная, резистивная, эффективно- и глухозаземлённая</w:t>
       </w:r>
     </w:p>
     <w:tbl>
@@ -2537,6 +2591,60 @@
     </w:p>
     <w:p>
       <w:pPr>
+        <w:spacing w:before="240" w:after="120"/>
+        <w:jc w:val="center"/>
+      </w:pPr>
+      <w:r>
+        <w:drawing>
+          <wp:inline xmlns:a="http://schemas.openxmlformats.org/drawingml/2006/main" xmlns:pic="http://schemas.openxmlformats.org/drawingml/2006/picture">
+            <wp:extent cx="5400000" cy="1844331"/>
+            <wp:docPr id="2" name="Picture 2"/>
+            <wp:cNvGraphicFramePr>
+              <a:graphicFrameLocks noChangeAspect="1"/>
+            </wp:cNvGraphicFramePr>
+            <a:graphic>
+              <a:graphicData uri="http://schemas.openxmlformats.org/drawingml/2006/picture">
+                <pic:pic>
+                  <pic:nvPicPr>
+                    <pic:cNvPr id="0" name="fig_symmetrical_components.png"/>
+                    <pic:cNvPicPr/>
+                  </pic:nvPicPr>
+                  <pic:blipFill>
+                    <a:blip r:embed="rId10"/>
+                    <a:stretch>
+                      <a:fillRect/>
+                    </a:stretch>
+                  </pic:blipFill>
+                  <pic:spPr>
+                    <a:xfrm>
+                      <a:off x="0" y="0"/>
+                      <a:ext cx="5400000" cy="1844331"/>
+                    </a:xfrm>
+                    <a:prstGeom prst="rect"/>
+                  </pic:spPr>
+                </pic:pic>
+              </a:graphicData>
+            </a:graphic>
+          </wp:inline>
+        </w:drawing>
+      </w:r>
+    </w:p>
+    <w:p>
+      <w:pPr>
+        <w:spacing w:before="120" w:after="240"/>
+        <w:jc w:val="center"/>
+      </w:pPr>
+      <w:r>
+        <w:rPr>
+          <w:rFonts w:ascii="Times New Roman" w:hAnsi="Times New Roman"/>
+          <w:b w:val="0"/>
+          <w:sz w:val="28"/>
+        </w:rPr>
+        <w:t>Рисунок 2 — Симметричные составляющие: системы прямой (1), обратной (2) и нулевой (0) последовательностей</w:t>
+      </w:r>
+    </w:p>
+    <w:p>
+      <w:pPr>
         <w:pStyle w:val="Heading3"/>
       </w:pPr>
       <w:r>
@@ -2675,6 +2783,60 @@
       <w:pPr/>
       <w:r>
         <w:t>Векторная диаграмма: вектор U_A коллапсирует в начало координат; векторы U_B, U_C удлиняются в √3 раз и разворачиваются на 30°; вектор U_N направлен противоположно E_A; вектор полного тока I_З опережает U_N на 90° (ёмкостный характер).</w:t>
+      </w:r>
+    </w:p>
+    <w:p>
+      <w:pPr>
+        <w:spacing w:before="240" w:after="120"/>
+        <w:jc w:val="center"/>
+      </w:pPr>
+      <w:r>
+        <w:drawing>
+          <wp:inline xmlns:a="http://schemas.openxmlformats.org/drawingml/2006/main" xmlns:pic="http://schemas.openxmlformats.org/drawingml/2006/picture">
+            <wp:extent cx="3715519" cy="3843535"/>
+            <wp:docPr id="3" name="Picture 3"/>
+            <wp:cNvGraphicFramePr>
+              <a:graphicFrameLocks noChangeAspect="1"/>
+            </wp:cNvGraphicFramePr>
+            <a:graphic>
+              <a:graphicData uri="http://schemas.openxmlformats.org/drawingml/2006/picture">
+                <pic:pic>
+                  <pic:nvPicPr>
+                    <pic:cNvPr id="0" name="fig_ozz_vectors.png"/>
+                    <pic:cNvPicPr/>
+                  </pic:nvPicPr>
+                  <pic:blipFill>
+                    <a:blip r:embed="rId11"/>
+                    <a:stretch>
+                      <a:fillRect/>
+                    </a:stretch>
+                  </pic:blipFill>
+                  <pic:spPr>
+                    <a:xfrm>
+                      <a:off x="0" y="0"/>
+                      <a:ext cx="3715519" cy="3843535"/>
+                    </a:xfrm>
+                    <a:prstGeom prst="rect"/>
+                  </pic:spPr>
+                </pic:pic>
+              </a:graphicData>
+            </a:graphic>
+          </wp:inline>
+        </w:drawing>
+      </w:r>
+    </w:p>
+    <w:p>
+      <w:pPr>
+        <w:spacing w:before="120" w:after="240"/>
+        <w:jc w:val="center"/>
+      </w:pPr>
+      <w:r>
+        <w:rPr>
+          <w:rFonts w:ascii="Times New Roman" w:hAnsi="Times New Roman"/>
+          <w:b w:val="0"/>
+          <w:sz w:val="28"/>
+        </w:rPr>
+        <w:t>Рисунок 3 — Векторная диаграмма напряжений при ОЗЗ фазы А: U̇_A коллапсирует в ноль, напряжения здоровых фаз растут в √3 раз, нейтраль смещается на U̇_N = −E_A</w:t>
       </w:r>
     </w:p>
     <w:p>
@@ -3211,6 +3373,60 @@
     </w:p>
     <w:p>
       <w:pPr>
+        <w:spacing w:before="240" w:after="120"/>
+        <w:jc w:val="center"/>
+      </w:pPr>
+      <w:r>
+        <w:drawing>
+          <wp:inline xmlns:a="http://schemas.openxmlformats.org/drawingml/2006/main" xmlns:pic="http://schemas.openxmlformats.org/drawingml/2006/picture">
+            <wp:extent cx="4148336" cy="2093980"/>
+            <wp:docPr id="4" name="Picture 4"/>
+            <wp:cNvGraphicFramePr>
+              <a:graphicFrameLocks noChangeAspect="1"/>
+            </wp:cNvGraphicFramePr>
+            <a:graphic>
+              <a:graphicData uri="http://schemas.openxmlformats.org/drawingml/2006/picture">
+                <pic:pic>
+                  <pic:nvPicPr>
+                    <pic:cNvPr id="0" name="fig_zero_seq_circuit.png"/>
+                    <pic:cNvPicPr/>
+                  </pic:nvPicPr>
+                  <pic:blipFill>
+                    <a:blip r:embed="rId12"/>
+                    <a:stretch>
+                      <a:fillRect/>
+                    </a:stretch>
+                  </pic:blipFill>
+                  <pic:spPr>
+                    <a:xfrm>
+                      <a:off x="0" y="0"/>
+                      <a:ext cx="4148336" cy="2093980"/>
+                    </a:xfrm>
+                    <a:prstGeom prst="rect"/>
+                  </pic:spPr>
+                </pic:pic>
+              </a:graphicData>
+            </a:graphic>
+          </wp:inline>
+        </w:drawing>
+      </w:r>
+    </w:p>
+    <w:p>
+      <w:pPr>
+        <w:spacing w:before="120" w:after="240"/>
+        <w:jc w:val="center"/>
+      </w:pPr>
+      <w:r>
+        <w:rPr>
+          <w:rFonts w:ascii="Times New Roman" w:hAnsi="Times New Roman"/>
+          <w:b w:val="0"/>
+          <w:sz w:val="28"/>
+        </w:rPr>
+        <w:t>Рисунок 4 — Схема замещения нулевой последовательности при ОЗЗ: фиктивный источник U_к0, ёмкости фаз 3C₀, сопротивление в нейтрали 3R_N (или j3X_L)</w:t>
+      </w:r>
+    </w:p>
+    <w:p>
+      <w:pPr>
         <w:pStyle w:val="Heading3"/>
       </w:pPr>
       <w:r>
@@ -3468,6 +3684,60 @@
       <w:pPr/>
       <w:r>
         <w:t>где I_C — ёмкостный ток ОЗЗ, А; ω — угловая частота (314 рад/с); C_0 — удельная ёмкость фазы, Ф/км; C_Σ — суммарная ёмкость трёх фаз, Ф; U_ф — фазное напряжение, В; L — длина связанных линий, км. Удельный ток: КЛ 6–10 кВ — 1,0–1,2 А/км, ВЛ — 0,01–0,03 А/км.</w:t>
+      </w:r>
+    </w:p>
+    <w:p>
+      <w:pPr>
+        <w:spacing w:before="240" w:after="120"/>
+        <w:jc w:val="center"/>
+      </w:pPr>
+      <w:r>
+        <w:drawing>
+          <wp:inline xmlns:a="http://schemas.openxmlformats.org/drawingml/2006/main" xmlns:pic="http://schemas.openxmlformats.org/drawingml/2006/picture">
+            <wp:extent cx="4434848" cy="2633477"/>
+            <wp:docPr id="5" name="Picture 5"/>
+            <wp:cNvGraphicFramePr>
+              <a:graphicFrameLocks noChangeAspect="1"/>
+            </wp:cNvGraphicFramePr>
+            <a:graphic>
+              <a:graphicData uri="http://schemas.openxmlformats.org/drawingml/2006/picture">
+                <pic:pic>
+                  <pic:nvPicPr>
+                    <pic:cNvPr id="0" name="fig_isolated_net.png"/>
+                    <pic:cNvPicPr/>
+                  </pic:nvPicPr>
+                  <pic:blipFill>
+                    <a:blip r:embed="rId13"/>
+                    <a:stretch>
+                      <a:fillRect/>
+                    </a:stretch>
+                  </pic:blipFill>
+                  <pic:spPr>
+                    <a:xfrm>
+                      <a:off x="0" y="0"/>
+                      <a:ext cx="4434848" cy="2633477"/>
+                    </a:xfrm>
+                    <a:prstGeom prst="rect"/>
+                  </pic:spPr>
+                </pic:pic>
+              </a:graphicData>
+            </a:graphic>
+          </wp:inline>
+        </w:drawing>
+      </w:r>
+    </w:p>
+    <w:p>
+      <w:pPr>
+        <w:spacing w:before="120" w:after="240"/>
+        <w:jc w:val="center"/>
+      </w:pPr>
+      <w:r>
+        <w:rPr>
+          <w:rFonts w:ascii="Times New Roman" w:hAnsi="Times New Roman"/>
+          <w:b w:val="0"/>
+          <w:sz w:val="28"/>
+        </w:rPr>
+        <w:t>Рисунок 5 — Сеть с изолированной нейтралью: фазные провода, ёмкости фаз относительно земли C₀, нейтраль без связи с землёй</w:t>
       </w:r>
     </w:p>
     <w:p>
@@ -4375,6 +4645,60 @@
     </w:p>
     <w:p>
       <w:pPr>
+        <w:spacing w:before="240" w:after="120"/>
+        <w:jc w:val="center"/>
+      </w:pPr>
+      <w:r>
+        <w:drawing>
+          <wp:inline xmlns:a="http://schemas.openxmlformats.org/drawingml/2006/main" xmlns:pic="http://schemas.openxmlformats.org/drawingml/2006/picture">
+            <wp:extent cx="5306578" cy="3218694"/>
+            <wp:docPr id="6" name="Picture 6"/>
+            <wp:cNvGraphicFramePr>
+              <a:graphicFrameLocks noChangeAspect="1"/>
+            </wp:cNvGraphicFramePr>
+            <a:graphic>
+              <a:graphicData uri="http://schemas.openxmlformats.org/drawingml/2006/picture">
+                <pic:pic>
+                  <pic:nvPicPr>
+                    <pic:cNvPr id="0" name="fig_arc_overvoltage.png"/>
+                    <pic:cNvPicPr/>
+                  </pic:nvPicPr>
+                  <pic:blipFill>
+                    <a:blip r:embed="rId14"/>
+                    <a:stretch>
+                      <a:fillRect/>
+                    </a:stretch>
+                  </pic:blipFill>
+                  <pic:spPr>
+                    <a:xfrm>
+                      <a:off x="0" y="0"/>
+                      <a:ext cx="5306578" cy="3218694"/>
+                    </a:xfrm>
+                    <a:prstGeom prst="rect"/>
+                  </pic:spPr>
+                </pic:pic>
+              </a:graphicData>
+            </a:graphic>
+          </wp:inline>
+        </w:drawing>
+      </w:r>
+    </w:p>
+    <w:p>
+      <w:pPr>
+        <w:spacing w:before="120" w:after="240"/>
+        <w:jc w:val="center"/>
+      </w:pPr>
+      <w:r>
+        <w:rPr>
+          <w:rFonts w:ascii="Times New Roman" w:hAnsi="Times New Roman"/>
+          <w:b w:val="0"/>
+          <w:sz w:val="28"/>
+        </w:rPr>
+        <w:t>Рисунок 6 — Эскалация дуговых перенапряжений при перемежающемся ОЗЗ: ступенчатый рост от 2,4 до 3,5 U_ф с каждым повторным зажиганием дуги</w:t>
+      </w:r>
+    </w:p>
+    <w:p>
+      <w:pPr>
         <w:pStyle w:val="Heading3"/>
       </w:pPr>
       <w:r>
@@ -5499,6 +5823,60 @@
     </w:p>
     <w:p>
       <w:pPr>
+        <w:spacing w:before="240" w:after="120"/>
+        <w:jc w:val="center"/>
+      </w:pPr>
+      <w:r>
+        <w:drawing>
+          <wp:inline xmlns:a="http://schemas.openxmlformats.org/drawingml/2006/main" xmlns:pic="http://schemas.openxmlformats.org/drawingml/2006/picture">
+            <wp:extent cx="5400000" cy="2524260"/>
+            <wp:docPr id="7" name="Picture 7"/>
+            <wp:cNvGraphicFramePr>
+              <a:graphicFrameLocks noChangeAspect="1"/>
+            </wp:cNvGraphicFramePr>
+            <a:graphic>
+              <a:graphicData uri="http://schemas.openxmlformats.org/drawingml/2006/picture">
+                <pic:pic>
+                  <pic:nvPicPr>
+                    <pic:cNvPr id="0" name="fig_compensation.png"/>
+                    <pic:cNvPicPr/>
+                  </pic:nvPicPr>
+                  <pic:blipFill>
+                    <a:blip r:embed="rId15"/>
+                    <a:stretch>
+                      <a:fillRect/>
+                    </a:stretch>
+                  </pic:blipFill>
+                  <pic:spPr>
+                    <a:xfrm>
+                      <a:off x="0" y="0"/>
+                      <a:ext cx="5400000" cy="2524260"/>
+                    </a:xfrm>
+                    <a:prstGeom prst="rect"/>
+                  </pic:spPr>
+                </pic:pic>
+              </a:graphicData>
+            </a:graphic>
+          </wp:inline>
+        </w:drawing>
+      </w:r>
+    </w:p>
+    <w:p>
+      <w:pPr>
+        <w:spacing w:before="120" w:after="240"/>
+        <w:jc w:val="center"/>
+      </w:pPr>
+      <w:r>
+        <w:rPr>
+          <w:rFonts w:ascii="Times New Roman" w:hAnsi="Times New Roman"/>
+          <w:b w:val="0"/>
+          <w:sz w:val="28"/>
+        </w:rPr>
+        <w:t>Рисунок 7 — Компенсированная нейтраль: схема включения дугогасящего реактора (ДГР) и взаимная компенсация ёмкостного I_C и индуктивного I_L токов</w:t>
+      </w:r>
+    </w:p>
+    <w:p>
+      <w:pPr>
         <w:pStyle w:val="Heading3"/>
       </w:pPr>
       <w:r>
@@ -5874,6 +6252,60 @@
       <w:pPr/>
       <w:r>
         <w:t>где U_н — вектор напряжения смещения нейтрали компенсированной сети, В; U_0 — напряжение естественной несимметрии (смещение при изолированной нейтрали), В; g_0 — активная проводимость утечек и потерь трёх фаз сети, См; g_p — активная проводимость потерь ДГР, См; c_0 — суммарная ёмкость трёх фаз сети относительно земли (C_A + C_B + C_C), Ф; L_p — индуктивность ДГР, Гн; ω — синхронная угловая частота (2·π·f), рад/с.</w:t>
+      </w:r>
+    </w:p>
+    <w:p>
+      <w:pPr>
+        <w:spacing w:before="240" w:after="120"/>
+        <w:jc w:val="center"/>
+      </w:pPr>
+      <w:r>
+        <w:drawing>
+          <wp:inline xmlns:a="http://schemas.openxmlformats.org/drawingml/2006/main" xmlns:pic="http://schemas.openxmlformats.org/drawingml/2006/picture">
+            <wp:extent cx="5065786" cy="3304039"/>
+            <wp:docPr id="8" name="Picture 8"/>
+            <wp:cNvGraphicFramePr>
+              <a:graphicFrameLocks noChangeAspect="1"/>
+            </wp:cNvGraphicFramePr>
+            <a:graphic>
+              <a:graphicData uri="http://schemas.openxmlformats.org/drawingml/2006/picture">
+                <pic:pic>
+                  <pic:nvPicPr>
+                    <pic:cNvPr id="0" name="fig_resonance_curve.png"/>
+                    <pic:cNvPicPr/>
+                  </pic:nvPicPr>
+                  <pic:blipFill>
+                    <a:blip r:embed="rId16"/>
+                    <a:stretch>
+                      <a:fillRect/>
+                    </a:stretch>
+                  </pic:blipFill>
+                  <pic:spPr>
+                    <a:xfrm>
+                      <a:off x="0" y="0"/>
+                      <a:ext cx="5065786" cy="3304039"/>
+                    </a:xfrm>
+                    <a:prstGeom prst="rect"/>
+                  </pic:spPr>
+                </pic:pic>
+              </a:graphicData>
+            </a:graphic>
+          </wp:inline>
+        </w:drawing>
+      </w:r>
+    </w:p>
+    <w:p>
+      <w:pPr>
+        <w:spacing w:before="120" w:after="240"/>
+        <w:jc w:val="center"/>
+      </w:pPr>
+      <w:r>
+        <w:rPr>
+          <w:rFonts w:ascii="Times New Roman" w:hAnsi="Times New Roman"/>
+          <w:b w:val="0"/>
+          <w:sz w:val="28"/>
+        </w:rPr>
+        <w:t>Рисунок 8 — Резонансная кривая напряжения смещения нейтрали U_н от степени расстройки ν: максимум при точном резонансе (ν = 0)</w:t>
       </w:r>
     </w:p>
     <w:p>
@@ -7463,6 +7895,60 @@
       <w:pPr/>
       <w:r>
         <w:t>Векторная диаграмма: вектор U_N направлен противоположно ЭДС повреждённой фазы E_A. Вектор ёмкостного тока I_C опережает U_N на 90°, вектор активного тока резистора I_R совпадает по фазе с U_N. Результирующий ток I_зам — гипотенуза прямоугольного треугольника с катетами I_C и I_R, опережает U_N на угол φ = arctg(I_C/I_R). Чем меньше R_N, тем длиннее I_R и тем меньше угол сдвига полного тока относительно U_N.</w:t>
+      </w:r>
+    </w:p>
+    <w:p>
+      <w:pPr>
+        <w:spacing w:before="240" w:after="120"/>
+        <w:jc w:val="center"/>
+      </w:pPr>
+      <w:r>
+        <w:drawing>
+          <wp:inline xmlns:a="http://schemas.openxmlformats.org/drawingml/2006/main" xmlns:pic="http://schemas.openxmlformats.org/drawingml/2006/picture">
+            <wp:extent cx="5400000" cy="2564729"/>
+            <wp:docPr id="9" name="Picture 9"/>
+            <wp:cNvGraphicFramePr>
+              <a:graphicFrameLocks noChangeAspect="1"/>
+            </wp:cNvGraphicFramePr>
+            <a:graphic>
+              <a:graphicData uri="http://schemas.openxmlformats.org/drawingml/2006/picture">
+                <pic:pic>
+                  <pic:nvPicPr>
+                    <pic:cNvPr id="0" name="fig_resistive_grounding.png"/>
+                    <pic:cNvPicPr/>
+                  </pic:nvPicPr>
+                  <pic:blipFill>
+                    <a:blip r:embed="rId17"/>
+                    <a:stretch>
+                      <a:fillRect/>
+                    </a:stretch>
+                  </pic:blipFill>
+                  <pic:spPr>
+                    <a:xfrm>
+                      <a:off x="0" y="0"/>
+                      <a:ext cx="5400000" cy="2564729"/>
+                    </a:xfrm>
+                    <a:prstGeom prst="rect"/>
+                  </pic:spPr>
+                </pic:pic>
+              </a:graphicData>
+            </a:graphic>
+          </wp:inline>
+        </w:drawing>
+      </w:r>
+    </w:p>
+    <w:p>
+      <w:pPr>
+        <w:spacing w:before="120" w:after="240"/>
+        <w:jc w:val="center"/>
+      </w:pPr>
+      <w:r>
+        <w:rPr>
+          <w:rFonts w:ascii="Times New Roman" w:hAnsi="Times New Roman"/>
+          <w:b w:val="0"/>
+          <w:sz w:val="28"/>
+        </w:rPr>
+        <w:t>Рисунок 9 — Резистивное заземление нейтрали: схема включения резистора R_N и векторная диаграмма токов I_C, I_R и полного тока I_зам</w:t>
       </w:r>
     </w:p>
     <w:p>
@@ -13801,7 +14287,7 @@
       </w:r>
     </w:p>
     <w:sectPr>
-      <w:footerReference w:type="default" r:id="rId9"/>
+      <w:footerReference w:type="default" r:id="rId18"/>
       <w:pgSz w:w="11906" w:h="16838"/>
       <w:pgMar w:top="1134" w:right="850" w:bottom="1134" w:left="1701" w:header="720" w:footer="720" w:gutter="0"/>
       <w:cols w:space="720"/>

</xml_diff>